<commit_message>
Add corresponding author + grant numbers
</commit_message>
<xml_diff>
--- a/paper/drafts/data_descriptor_dynamic_wdpa.docx
+++ b/paper/drafts/data_descriptor_dynamic_wdpa.docx
@@ -39,7 +39,7 @@
         <w:pStyle w:val="Date"/>
       </w:pPr>
       <w:r>
-        <w:t xml:space="preserve">2026-04-30</w:t>
+        <w:t xml:space="preserve">2026-05-07</w:t>
       </w:r>
     </w:p>
     <w:p>
@@ -56,6 +56,18 @@
       </w:pPr>
       <w:r>
         <w:t xml:space="preserve">Georeferenced data on protected areas underpin much of the research studying the impacts of nature conservation on the environment and human wellbeing. Yet, existing databases typically record only the current state of each site. When boundaries or designations change, previous configurations are silently overwritten, preventing reliable temporal analyses and introducing bias in impact evaluations. We present a replicable temporal data model that extends the World Database on Protected Areas with time-bounded states documenting boundary modifications, status reclassifications, governance changes, temporary protections, and internal zoning. The model is designed to be generalizable to any national context and extensible to the full diversity of protected area modifications. We demonstrate it on Madagascar’s 123 terrestrial protected areas over 2000–2025, integrating historical archive snapshots, successive national system datasets, legal texts from the national legislative database, and expert literature. All amendments are stored in a version-controlled YAML registry and consolidated through deterministic rules implemented in R. The resulting dataset is distributed in GeoPackage and GeoParquet formats, enabling spatio-temporal analyses of conservation dynamics.</w:t>
+      </w:r>
+    </w:p>
+    <w:p>
+      <w:pPr>
+        <w:pStyle w:val="FirstParagraph"/>
+      </w:pPr>
+      <w:r>
+        <w:rPr>
+          <w:i/>
+          <w:iCs/>
+        </w:rPr>
+        <w:t xml:space="preserve">Corresponding author: Florent Bédécarrats (florent.bedecarrats@ird.fr)</w:t>
       </w:r>
     </w:p>
     <w:bookmarkStart w:id="9" w:name="background-summary"/>
@@ -2113,17 +2125,17 @@
         <w:pStyle w:val="FirstParagraph"/>
       </w:pPr>
       <w:r>
-        <w:t xml:space="preserve">This work was conducted within the BETSAKA project, supported by KfW, Agence Française de Développement (AFD), Institut de Recherche pour le Développement (IRD), and Agence Nationale de la Recherche (ANR). The project is coordinated by IRD/UMI-SOURCE and the Université d’Antananarivo/CERED. We thank the Vahatra Association for the foundational monograph on Madagascar’s protected areas, the CNLEGIS team for maintaining the national legislative database, and the organizations (MEDD, MNP, MBG, GERP, WWF) that shared core zone spatial data.</w:t>
+        <w:t xml:space="preserve">This work was conducted within the BETSAKA project, supported by KfW (grant BMZ 2018-68-538/KfW 108778), Agence Française de Développement (grant PAIRES-CZZ2557), Institut de Recherche pour le Développement (IRD) and Agence Nationale de la Recherche (grant ANR-22-CPJ1-0052-01). The project is coordinated by IRD/UMI-SOURCE and the Université d’Antananarivo/CERED. We thank the Vahatra Association for the foundational monograph on Madagascar’s protected areas, the CNLEGIS team for maintaining the national legislative database, and the organizations (MEDD, MNP, MBG, GERP, WWF) that shared core zone spatial data.</w:t>
       </w:r>
     </w:p>
     <w:bookmarkEnd w:id="38"/>
-    <w:bookmarkStart w:id="39" w:name="author-contributions"/>
+    <w:bookmarkStart w:id="39" w:name="funding"/>
     <w:p>
       <w:pPr>
         <w:pStyle w:val="Heading1"/>
       </w:pPr>
       <w:r>
-        <w:t xml:space="preserve">8. Author Contributions</w:t>
+        <w:t xml:space="preserve">8. Funding</w:t>
       </w:r>
     </w:p>
     <w:p>
@@ -2131,17 +2143,35 @@
         <w:pStyle w:val="FirstParagraph"/>
       </w:pPr>
       <w:r>
+        <w:t xml:space="preserve">This work was supported by KfW (grant number BMZ 2018-68-538 / KfW 108778), Agence Française de Développement (grant number PAIRES-CZZ2557), and Agence Nationale de la Recherche (grant number ANR-22-CPJ1-0052-01).</w:t>
+      </w:r>
+    </w:p>
+    <w:bookmarkEnd w:id="39"/>
+    <w:bookmarkStart w:id="40" w:name="author-contributions"/>
+    <w:p>
+      <w:pPr>
+        <w:pStyle w:val="Heading1"/>
+      </w:pPr>
+      <w:r>
+        <w:t xml:space="preserve">9. Author Contributions</w:t>
+      </w:r>
+    </w:p>
+    <w:p>
+      <w:pPr>
+        <w:pStyle w:val="FirstParagraph"/>
+      </w:pPr>
+      <w:r>
         <w:t xml:space="preserve">Following the CRediT (Contributor Roles Taxonomy) framework: F.B.: Conceptualization, Methodology, Software, Formal analysis, Data curation, Writing – original draft, Visualization, Project administration. S.R.: Investigation, Data curation, Validation, Resources, Writing – review &amp; editing. O.D.A.: Investigation, Data curation, Validation, Resources, Writing – review &amp; editing.</w:t>
       </w:r>
     </w:p>
-    <w:bookmarkEnd w:id="39"/>
-    <w:bookmarkStart w:id="40" w:name="competing-interests"/>
+    <w:bookmarkEnd w:id="40"/>
+    <w:bookmarkStart w:id="41" w:name="competing-interests"/>
     <w:p>
       <w:pPr>
         <w:pStyle w:val="Heading1"/>
       </w:pPr>
       <w:r>
-        <w:t xml:space="preserve">9. Competing Interests</w:t>
+        <w:t xml:space="preserve">10. Competing Interests</w:t>
       </w:r>
     </w:p>
     <w:p>
@@ -2152,14 +2182,14 @@
         <w:t xml:space="preserve">S.R. is a civil servant in charge of protected area governance at the Ministère de l’Environnement et du Développement Durable (MEDD) of Madagascar. O.D.A. heads the data information system and innovation unit at Madagascar National Parks (MNP). Producing and maintaining protected area information is part of their professional responsibilities. The authors have no financial conflicts of interest to declare.</w:t>
       </w:r>
     </w:p>
-    <w:bookmarkEnd w:id="40"/>
-    <w:bookmarkStart w:id="41" w:name="funding"/>
+    <w:bookmarkEnd w:id="41"/>
+    <w:bookmarkStart w:id="42" w:name="funding-1"/>
     <w:p>
       <w:pPr>
         <w:pStyle w:val="Heading1"/>
       </w:pPr>
       <w:r>
-        <w:t xml:space="preserve">10. Funding</w:t>
+        <w:t xml:space="preserve">11. Funding</w:t>
       </w:r>
     </w:p>
     <w:p>
@@ -2170,18 +2200,18 @@
         <w:t xml:space="preserve">BETSAKA project, supported by KfW, Agence Française de Développement (AFD), Institut de Recherche pour le Développement (IRD), and Agence Nationale de la Recherche (ANR).</w:t>
       </w:r>
     </w:p>
-    <w:bookmarkEnd w:id="41"/>
-    <w:bookmarkStart w:id="53" w:name="references"/>
+    <w:bookmarkEnd w:id="42"/>
+    <w:bookmarkStart w:id="54" w:name="references"/>
     <w:p>
       <w:pPr>
         <w:pStyle w:val="Heading1"/>
       </w:pPr>
       <w:r>
-        <w:t xml:space="preserve">11. References</w:t>
-      </w:r>
-    </w:p>
-    <w:bookmarkStart w:id="52" w:name="refs"/>
-    <w:bookmarkStart w:id="42" w:name="ref-Bingham2019a"/>
+        <w:t xml:space="preserve">12. References</w:t>
+      </w:r>
+    </w:p>
+    <w:bookmarkStart w:id="53" w:name="refs"/>
+    <w:bookmarkStart w:id="43" w:name="ref-Bingham2019a"/>
     <w:p>
       <w:pPr>
         <w:pStyle w:val="Bibliography"/>
@@ -2226,8 +2256,8 @@
         <w:t xml:space="preserve">and world database on other effective area- based conservation measures: 1.6. UNEP-WCMC, Cambridge, UK</w:t>
       </w:r>
     </w:p>
-    <w:bookmarkEnd w:id="42"/>
-    <w:bookmarkStart w:id="43" w:name="ref-bingham2019b"/>
+    <w:bookmarkEnd w:id="43"/>
+    <w:bookmarkStart w:id="44" w:name="ref-bingham2019b"/>
     <w:p>
       <w:pPr>
         <w:pStyle w:val="Bibliography"/>
@@ -2257,8 +2287,8 @@
         <w:t xml:space="preserve">. Nature Ecology &amp; Evolution 3:737–743</w:t>
       </w:r>
     </w:p>
-    <w:bookmarkEnd w:id="43"/>
-    <w:bookmarkStart w:id="44" w:name="ref-Ebregt2000"/>
+    <w:bookmarkEnd w:id="44"/>
+    <w:bookmarkStart w:id="45" w:name="ref-Ebregt2000"/>
     <w:p>
       <w:pPr>
         <w:pStyle w:val="Bibliography"/>
@@ -2375,8 +2405,8 @@
         <w:t xml:space="preserve">. International Agricultural Centre, The Netherlands, 64pp</w:t>
       </w:r>
     </w:p>
-    <w:bookmarkEnd w:id="44"/>
-    <w:bookmarkStart w:id="45" w:name="ref-Goodman2018"/>
+    <w:bookmarkEnd w:id="45"/>
+    <w:bookmarkStart w:id="46" w:name="ref-Goodman2018"/>
     <w:p>
       <w:pPr>
         <w:pStyle w:val="Bibliography"/>
@@ -2394,8 +2424,8 @@
         <w:t xml:space="preserve">: Leur histoire, description et biote. Association Vahatra</w:t>
       </w:r>
     </w:p>
-    <w:bookmarkEnd w:id="45"/>
-    <w:bookmarkStart w:id="46" w:name="ref-lewisDynamicsGlobalProtectedarea2019"/>
+    <w:bookmarkEnd w:id="46"/>
+    <w:bookmarkStart w:id="47" w:name="ref-lewisDynamicsGlobalProtectedarea2019"/>
     <w:p>
       <w:pPr>
         <w:pStyle w:val="Bibliography"/>
@@ -2404,8 +2434,8 @@
         <w:t xml:space="preserve">Lewis E, MacSharry B, Juffe-Bignoli D, et al (2019) Dynamics in the global protected-area estate since 2004. Conservation Biology 33:570–579</w:t>
       </w:r>
     </w:p>
-    <w:bookmarkEnd w:id="46"/>
-    <w:bookmarkStart w:id="47" w:name="ref-Maxwell2020"/>
+    <w:bookmarkEnd w:id="47"/>
+    <w:bookmarkStart w:id="48" w:name="ref-Maxwell2020"/>
     <w:p>
       <w:pPr>
         <w:pStyle w:val="Bibliography"/>
@@ -2414,8 +2444,8 @@
         <w:t xml:space="preserve">Maxwell SL, Cazalis V, Dudley N, et al (2020) Area-based conservation in the twenty-first century. Nature 586:217–227</w:t>
       </w:r>
     </w:p>
-    <w:bookmarkEnd w:id="47"/>
-    <w:bookmarkStart w:id="48" w:name="ref-symesWhyWeLose2016"/>
+    <w:bookmarkEnd w:id="48"/>
+    <w:bookmarkStart w:id="49" w:name="ref-symesWhyWeLose2016"/>
     <w:p>
       <w:pPr>
         <w:pStyle w:val="Bibliography"/>
@@ -2436,8 +2466,8 @@
         <w:t xml:space="preserve">influencing protected area downgrading, downsizing and degazettement in the tropics and subtropics. Global Change Biology 22:656–665</w:t>
       </w:r>
     </w:p>
-    <w:bookmarkEnd w:id="48"/>
-    <w:bookmarkStart w:id="49" w:name="ref-unep2024"/>
+    <w:bookmarkEnd w:id="49"/>
+    <w:bookmarkStart w:id="50" w:name="ref-unep2024"/>
     <w:p>
       <w:pPr>
         <w:pStyle w:val="Bibliography"/>
@@ -2446,8 +2476,8 @@
         <w:t xml:space="preserve">UNEP-WCMC and IUCN (2024) Protected planet report 2024. UNEP-WCMC; IUCN, Cambridge, United Kingdom; Gland, Switzerland</w:t>
       </w:r>
     </w:p>
-    <w:bookmarkEnd w:id="49"/>
-    <w:bookmarkStart w:id="51" w:name="ref-Waeber2020"/>
+    <w:bookmarkEnd w:id="50"/>
+    <w:bookmarkStart w:id="52" w:name="ref-Waeber2020"/>
     <w:p>
       <w:pPr>
         <w:pStyle w:val="Bibliography"/>
@@ -2464,7 +2494,7 @@
       <w:r>
         <w:t xml:space="preserve">: Managing biodiversity for a sustainable future. Protected Areas, National Parks and Sustainable Future AN Bakar and MN Suratman (eds) 89–108. https://doi.org/</w:t>
       </w:r>
-      <w:hyperlink r:id="rId50">
+      <w:hyperlink r:id="rId51">
         <w:r>
           <w:rPr>
             <w:rStyle w:val="Hyperlink"/>
@@ -2473,9 +2503,9 @@
         </w:r>
       </w:hyperlink>
     </w:p>
-    <w:bookmarkEnd w:id="51"/>
     <w:bookmarkEnd w:id="52"/>
     <w:bookmarkEnd w:id="53"/>
+    <w:bookmarkEnd w:id="54"/>
     <w:sectPr>
       <w:footnotePr>
         <w:numRestart w:val="eachSect"/>

</xml_diff>